<commit_message>
Add Frodo halfling traits
</commit_message>
<xml_diff>
--- a/Essentials/Frodo.docx
+++ b/Essentials/Frodo.docx
@@ -19,6 +19,180 @@
           <w:sz w:val="56"/>
         </w:rPr>
         <w:t>Poklady Trominu - Frodo Pi??k</w:t>
+      </w:r>
+    </w:p>
+    <w:p>
+      <w:pPr>
+        <w:spacing w:before="260" w:after="80"/>
+        <w:pBdr>
+          <w:bottom w:val="single" w:sz="8" w:space="6" w:color="7A4A22"/>
+        </w:pBdr>
+      </w:pPr>
+      <w:r>
+        <w:rPr>
+          <w:rFonts w:ascii="Garamond" w:hAnsi="Garamond"/>
+          <w:b/>
+          <w:i w:val="0"/>
+          <w:color w:val="5C3114"/>
+          <w:sz w:val="32"/>
+        </w:rPr>
+        <w:t>Lucky</w:t>
+      </w:r>
+    </w:p>
+    <w:p>
+      <w:pPr>
+        <w:pStyle w:val="ListBullet"/>
+        <w:spacing w:after="60"/>
+        <w:ind w:left="360"/>
+      </w:pPr>
+      <w:r>
+        <w:rPr>
+          <w:rFonts w:ascii="Garamond" w:hAnsi="Garamond"/>
+          <w:b w:val="0"/>
+          <w:i w:val="0"/>
+          <w:color w:val="2D1F15"/>
+          <w:sz w:val="23"/>
+        </w:rPr>
+        <w:t>When Frodo rolls a 1 on the d20 for an attack roll, ability check, or saving throw, he can reroll the die.</w:t>
+      </w:r>
+    </w:p>
+    <w:p>
+      <w:pPr>
+        <w:pStyle w:val="ListBullet"/>
+        <w:spacing w:after="60"/>
+        <w:ind w:left="360"/>
+      </w:pPr>
+      <w:r>
+        <w:rPr>
+          <w:rFonts w:ascii="Garamond" w:hAnsi="Garamond"/>
+          <w:b w:val="0"/>
+          <w:i w:val="0"/>
+          <w:color w:val="2D1F15"/>
+          <w:sz w:val="23"/>
+        </w:rPr>
+        <w:t>He must use the new roll.</w:t>
+      </w:r>
+    </w:p>
+    <w:p>
+      <w:pPr>
+        <w:spacing w:before="260" w:after="80"/>
+        <w:pBdr>
+          <w:bottom w:val="single" w:sz="8" w:space="6" w:color="7A4A22"/>
+        </w:pBdr>
+      </w:pPr>
+      <w:r>
+        <w:rPr>
+          <w:rFonts w:ascii="Garamond" w:hAnsi="Garamond"/>
+          <w:b/>
+          <w:i w:val="0"/>
+          <w:color w:val="5C3114"/>
+          <w:sz w:val="32"/>
+        </w:rPr>
+        <w:t>Brave</w:t>
+      </w:r>
+    </w:p>
+    <w:p>
+      <w:pPr>
+        <w:pStyle w:val="ListBullet"/>
+        <w:spacing w:after="60"/>
+        <w:ind w:left="360"/>
+      </w:pPr>
+      <w:r>
+        <w:rPr>
+          <w:rFonts w:ascii="Garamond" w:hAnsi="Garamond"/>
+          <w:b w:val="0"/>
+          <w:i w:val="0"/>
+          <w:color w:val="2D1F15"/>
+          <w:sz w:val="23"/>
+        </w:rPr>
+        <w:t>Frodo has advantage on saving throws against being frightened.</w:t>
+      </w:r>
+    </w:p>
+    <w:p>
+      <w:pPr>
+        <w:spacing w:before="260" w:after="80"/>
+        <w:pBdr>
+          <w:bottom w:val="single" w:sz="8" w:space="6" w:color="7A4A22"/>
+        </w:pBdr>
+      </w:pPr>
+      <w:r>
+        <w:rPr>
+          <w:rFonts w:ascii="Garamond" w:hAnsi="Garamond"/>
+          <w:b/>
+          <w:i w:val="0"/>
+          <w:color w:val="5C3114"/>
+          <w:sz w:val="32"/>
+        </w:rPr>
+        <w:t>Halfling Nimbleness</w:t>
+      </w:r>
+    </w:p>
+    <w:p>
+      <w:pPr>
+        <w:pStyle w:val="ListBullet"/>
+        <w:spacing w:after="60"/>
+        <w:ind w:left="360"/>
+      </w:pPr>
+      <w:r>
+        <w:rPr>
+          <w:rFonts w:ascii="Garamond" w:hAnsi="Garamond"/>
+          <w:b w:val="0"/>
+          <w:i w:val="0"/>
+          <w:color w:val="2D1F15"/>
+          <w:sz w:val="23"/>
+        </w:rPr>
+        <w:t>Frodo can move through the space of any creature that is larger than he is.</w:t>
+      </w:r>
+    </w:p>
+    <w:p>
+      <w:pPr>
+        <w:spacing w:before="260" w:after="80"/>
+        <w:pBdr>
+          <w:bottom w:val="single" w:sz="8" w:space="6" w:color="7A4A22"/>
+        </w:pBdr>
+      </w:pPr>
+      <w:r>
+        <w:rPr>
+          <w:rFonts w:ascii="Garamond" w:hAnsi="Garamond"/>
+          <w:b/>
+          <w:i w:val="0"/>
+          <w:color w:val="5C3114"/>
+          <w:sz w:val="32"/>
+        </w:rPr>
+        <w:t>Stout Resilience</w:t>
+      </w:r>
+    </w:p>
+    <w:p>
+      <w:pPr>
+        <w:pStyle w:val="ListBullet"/>
+        <w:spacing w:after="60"/>
+        <w:ind w:left="360"/>
+      </w:pPr>
+      <w:r>
+        <w:rPr>
+          <w:rFonts w:ascii="Garamond" w:hAnsi="Garamond"/>
+          <w:b w:val="0"/>
+          <w:i w:val="0"/>
+          <w:color w:val="2D1F15"/>
+          <w:sz w:val="23"/>
+        </w:rPr>
+        <w:t>Frodo has advantage on saving throws against poison.</w:t>
+      </w:r>
+    </w:p>
+    <w:p>
+      <w:pPr>
+        <w:pStyle w:val="ListBullet"/>
+        <w:spacing w:after="60"/>
+        <w:ind w:left="360"/>
+      </w:pPr>
+      <w:r>
+        <w:rPr>
+          <w:rFonts w:ascii="Garamond" w:hAnsi="Garamond"/>
+          <w:b w:val="0"/>
+          <w:i w:val="0"/>
+          <w:color w:val="2D1F15"/>
+          <w:sz w:val="23"/>
+        </w:rPr>
+        <w:t>He has resistance against poison damage.</w:t>
       </w:r>
     </w:p>
     <w:p>
@@ -328,107 +502,6 @@
           <w:sz w:val="23"/>
         </w:rPr>
         <w:t>When the frenzied rage ends, he suffers one level of exhaustion.</w:t>
-      </w:r>
-    </w:p>
-    <w:p>
-      <w:pPr>
-        <w:spacing w:before="260" w:after="80"/>
-        <w:pBdr>
-          <w:bottom w:val="single" w:sz="8" w:space="6" w:color="7A4A22"/>
-        </w:pBdr>
-      </w:pPr>
-      <w:r>
-        <w:rPr>
-          <w:rFonts w:ascii="Garamond" w:hAnsi="Garamond"/>
-          <w:b/>
-          <w:i w:val="0"/>
-          <w:color w:val="5C3114"/>
-          <w:sz w:val="32"/>
-        </w:rPr>
-        <w:t>Missing From the Provided Barbarian Source</w:t>
-      </w:r>
-    </w:p>
-    <w:p>
-      <w:pPr>
-        <w:spacing w:after="100"/>
-      </w:pPr>
-      <w:r>
-        <w:rPr>
-          <w:rFonts w:ascii="Garamond" w:hAnsi="Garamond"/>
-          <w:b w:val="0"/>
-          <w:i w:val="0"/>
-          <w:color w:val="2D1F15"/>
-          <w:sz w:val="23"/>
-        </w:rPr>
-        <w:t>These traits are written in Frodo's PDF, but they are racial halfling/stout halfling traits and were not present on the provided Barbarian class page.</w:t>
-      </w:r>
-    </w:p>
-    <w:p>
-      <w:pPr>
-        <w:pStyle w:val="ListBullet"/>
-        <w:spacing w:after="60"/>
-        <w:ind w:left="360"/>
-      </w:pPr>
-      <w:r>
-        <w:rPr>
-          <w:rFonts w:ascii="Garamond" w:hAnsi="Garamond"/>
-          <w:b w:val="0"/>
-          <w:i w:val="0"/>
-          <w:color w:val="2D1F15"/>
-          <w:sz w:val="23"/>
-        </w:rPr>
-        <w:t>Lucky</w:t>
-      </w:r>
-    </w:p>
-    <w:p>
-      <w:pPr>
-        <w:pStyle w:val="ListBullet"/>
-        <w:spacing w:after="60"/>
-        <w:ind w:left="360"/>
-      </w:pPr>
-      <w:r>
-        <w:rPr>
-          <w:rFonts w:ascii="Garamond" w:hAnsi="Garamond"/>
-          <w:b w:val="0"/>
-          <w:i w:val="0"/>
-          <w:color w:val="2D1F15"/>
-          <w:sz w:val="23"/>
-        </w:rPr>
-        <w:t>Brave</w:t>
-      </w:r>
-    </w:p>
-    <w:p>
-      <w:pPr>
-        <w:pStyle w:val="ListBullet"/>
-        <w:spacing w:after="60"/>
-        <w:ind w:left="360"/>
-      </w:pPr>
-      <w:r>
-        <w:rPr>
-          <w:rFonts w:ascii="Garamond" w:hAnsi="Garamond"/>
-          <w:b w:val="0"/>
-          <w:i w:val="0"/>
-          <w:color w:val="2D1F15"/>
-          <w:sz w:val="23"/>
-        </w:rPr>
-        <w:t>Nimbleness</w:t>
-      </w:r>
-    </w:p>
-    <w:p>
-      <w:pPr>
-        <w:pStyle w:val="ListBullet"/>
-        <w:spacing w:after="60"/>
-        <w:ind w:left="360"/>
-      </w:pPr>
-      <w:r>
-        <w:rPr>
-          <w:rFonts w:ascii="Garamond" w:hAnsi="Garamond"/>
-          <w:b w:val="0"/>
-          <w:i w:val="0"/>
-          <w:color w:val="2D1F15"/>
-          <w:sz w:val="23"/>
-        </w:rPr>
-        <w:t>Stout Resilience</w:t>
       </w:r>
     </w:p>
     <w:sectPr>

</xml_diff>